<commit_message>
Catat topik solar panel sbg bagian rapat 6 Agustus (diangkat Pak Raihan)
Dikonfirmasi user: pertanyaan solar panel & permintaan cost-benefit
analysis vs catu daya kabel (+CAPEX kabel) diangkat Pak Raihan (RU VII
Kasim) dalam rapat 6 Agustus, bukan topik terpisah dari follow-up WA
8 Agustus (WA hanya kelanjutan eksekusi perhitungannya).

- Tambah bagian 07 "Catu Daya (Solar Panel)" + tindak lanjut #9 ke
  Notulen_Meeting_GLD_6Agustus2026.docx/pdf
- Update memory (blockers_metrics, decisions dec:37, entities p:raihan)
- Reattribusi di Dashboard & Laporan Progres
</commit_message>
<xml_diff>
--- a/Deliverables/Notulen_Meeting_GLD_6Agustus2026.docx
+++ b/Deliverables/Notulen_Meeting_GLD_6Agustus2026.docx
@@ -1327,6 +1327,112 @@
       <w:pPr>
         <w:spacing w:after="200"/>
       </w:pPr>
+    </w:p>
+    <w:p>
+      <w:pPr>
+        <w:pBdr>
+          <w:bottom w:val="single" w:color="DCE3EE" w:sz="6" w:space="4"/>
+        </w:pBdr>
+        <w:spacing w:after="100" w:before="300"/>
+      </w:pPr>
+      <w:r>
+        <w:rPr>
+          <w:rFonts w:ascii="Calibri" w:cs="Calibri" w:eastAsia="Calibri" w:hAnsi="Calibri"/>
+          <w:b/>
+          <w:bCs/>
+          <w:color w:val="2B5FCB"/>
+          <w:sz w:val="26"/>
+          <w:szCs w:val="26"/>
+        </w:rPr>
+        <w:t xml:space="preserve">07  </w:t>
+      </w:r>
+      <w:r>
+        <w:rPr>
+          <w:rFonts w:ascii="Calibri" w:cs="Calibri" w:eastAsia="Calibri" w:hAnsi="Calibri"/>
+          <w:b/>
+          <w:bCs/>
+          <w:color w:val="262321"/>
+          <w:sz w:val="26"/>
+          <w:szCs w:val="26"/>
+        </w:rPr>
+        <w:t xml:space="preserve">Catu Daya (Solar Panel)</w:t>
+      </w:r>
+    </w:p>
+    <w:p>
+      <w:pPr>
+        <w:pStyle w:val="ListParagraph"/>
+        <w:numPr>
+          <w:ilvl w:val="0"/>
+          <w:numId w:val="2"/>
+        </w:numPr>
+        <w:spacing w:after="100"/>
+      </w:pPr>
+      <w:r>
+        <w:rPr>
+          <w:rFonts w:ascii="Calibri" w:cs="Calibri" w:eastAsia="Calibri" w:hAnsi="Calibri"/>
+          <w:color w:val="454B57"/>
+          <w:sz w:val="22"/>
+          <w:szCs w:val="22"/>
+        </w:rPr>
+        <w:t xml:space="preserve">Pak Raihan (RU VII Kasim) menanyakan kebutuhan solar panel apabila GLD menggunakan kombinasi baterai dan solar panel.</w:t>
+      </w:r>
+    </w:p>
+    <w:p>
+      <w:pPr>
+        <w:pStyle w:val="ListParagraph"/>
+        <w:numPr>
+          <w:ilvl w:val="0"/>
+          <w:numId w:val="2"/>
+        </w:numPr>
+        <w:spacing w:after="100"/>
+      </w:pPr>
+      <w:r>
+        <w:rPr>
+          <w:rFonts w:ascii="Calibri" w:cs="Calibri" w:eastAsia="Calibri" w:hAnsi="Calibri"/>
+          <w:color w:val="454B57"/>
+          <w:sz w:val="22"/>
+          <w:szCs w:val="22"/>
+        </w:rPr>
+        <w:t xml:space="preserve">Pertamina menyatakan ukuran fisik solar panel yang besar tidak menjadi masalah, dicontohkan setara panel lampu penerangan jalan umum (PJU) atau lebih besar.</w:t>
+      </w:r>
+    </w:p>
+    <w:p>
+      <w:pPr>
+        <w:pStyle w:val="ListParagraph"/>
+        <w:numPr>
+          <w:ilvl w:val="0"/>
+          <w:numId w:val="2"/>
+        </w:numPr>
+        <w:spacing w:after="100"/>
+      </w:pPr>
+      <w:r>
+        <w:rPr>
+          <w:rFonts w:ascii="Calibri" w:cs="Calibri" w:eastAsia="Calibri" w:hAnsi="Calibri"/>
+          <w:color w:val="454B57"/>
+          <w:sz w:val="22"/>
+          <w:szCs w:val="22"/>
+        </w:rPr>
+        <w:t xml:space="preserve">Tim diminta menyusun cost-benefit analysis antara solar panel dan catu daya kabel, termasuk CAPEX kabel (biaya pengadaan dan instalasi kabel) sebagai pembanding.</w:t>
+      </w:r>
+    </w:p>
+    <w:p>
+      <w:pPr>
+        <w:pStyle w:val="ListParagraph"/>
+        <w:numPr>
+          <w:ilvl w:val="0"/>
+          <w:numId w:val="2"/>
+        </w:numPr>
+        <w:spacing w:after="100"/>
+      </w:pPr>
+      <w:r>
+        <w:rPr>
+          <w:rFonts w:ascii="Calibri" w:cs="Calibri" w:eastAsia="Calibri" w:hAnsi="Calibri"/>
+          <w:color w:val="454B57"/>
+          <w:sz w:val="22"/>
+          <w:szCs w:val="22"/>
+        </w:rPr>
+        <w:t xml:space="preserve">Perhitungan kebutuhan daya (Wp) dan cost-benefit analysis akan disusun oleh Tim ITB Fisika.</w:t>
+      </w:r>
     </w:p>
     <w:p>
       <w:pPr>
@@ -2098,6 +2204,86 @@
           </w:p>
         </w:tc>
       </w:tr>
+      <w:tr>
+        <w:tc>
+          <w:tcPr>
+            <w:tcW w:type="dxa" w:w="700"/>
+            <w:shd w:fill="FFFFFF" w:val="clear"/>
+            <w:tcMar>
+              <w:top w:type="dxa" w:w="90"/>
+              <w:left w:type="dxa" w:w="110"/>
+              <w:bottom w:type="dxa" w:w="90"/>
+              <w:right w:type="dxa" w:w="110"/>
+            </w:tcMar>
+            <w:vAlign w:val="top"/>
+          </w:tcPr>
+          <w:p>
+            <w:r>
+              <w:rPr>
+                <w:rFonts w:ascii="Calibri" w:cs="Calibri" w:eastAsia="Calibri" w:hAnsi="Calibri"/>
+                <w:b w:val="false"/>
+                <w:bCs w:val="false"/>
+                <w:color w:val="454B57"/>
+                <w:sz w:val="20"/>
+                <w:szCs w:val="20"/>
+              </w:rPr>
+              <w:t xml:space="preserve">9</w:t>
+            </w:r>
+          </w:p>
+        </w:tc>
+        <w:tc>
+          <w:tcPr>
+            <w:tcW w:type="dxa" w:w="6600"/>
+            <w:shd w:fill="FFFFFF" w:val="clear"/>
+            <w:tcMar>
+              <w:top w:type="dxa" w:w="90"/>
+              <w:left w:type="dxa" w:w="110"/>
+              <w:bottom w:type="dxa" w:w="90"/>
+              <w:right w:type="dxa" w:w="110"/>
+            </w:tcMar>
+            <w:vAlign w:val="top"/>
+          </w:tcPr>
+          <w:p>
+            <w:r>
+              <w:rPr>
+                <w:rFonts w:ascii="Calibri" w:cs="Calibri" w:eastAsia="Calibri" w:hAnsi="Calibri"/>
+                <w:b w:val="false"/>
+                <w:bCs w:val="false"/>
+                <w:color w:val="454B57"/>
+                <w:sz w:val="20"/>
+                <w:szCs w:val="20"/>
+              </w:rPr>
+              <w:t xml:space="preserve">Menghitung kebutuhan solar panel (Wp) dan cost-benefit analysis vs catu daya kabel (termasuk CAPEX kabel)</w:t>
+            </w:r>
+          </w:p>
+        </w:tc>
+        <w:tc>
+          <w:tcPr>
+            <w:tcW w:type="dxa" w:w="2700"/>
+            <w:shd w:fill="FFFFFF" w:val="clear"/>
+            <w:tcMar>
+              <w:top w:type="dxa" w:w="90"/>
+              <w:left w:type="dxa" w:w="110"/>
+              <w:bottom w:type="dxa" w:w="90"/>
+              <w:right w:type="dxa" w:w="110"/>
+            </w:tcMar>
+            <w:vAlign w:val="top"/>
+          </w:tcPr>
+          <w:p>
+            <w:r>
+              <w:rPr>
+                <w:rFonts w:ascii="Calibri" w:cs="Calibri" w:eastAsia="Calibri" w:hAnsi="Calibri"/>
+                <w:b w:val="false"/>
+                <w:bCs w:val="false"/>
+                <w:color w:val="454B57"/>
+                <w:sz w:val="20"/>
+                <w:szCs w:val="20"/>
+              </w:rPr>
+              <w:t xml:space="preserve">Beny (ITB Fisika)</w:t>
+            </w:r>
+          </w:p>
+        </w:tc>
+      </w:tr>
     </w:tbl>
     <w:p>
       <w:pPr>
@@ -2114,7 +2300,7 @@
           <w:sz w:val="20"/>
           <w:szCs w:val="20"/>
         </w:rPr>
-        <w:t xml:space="preserve">Notulensi ini telah disusun berdasarkan poin-poin pembahasan dalam dokumen rapat dengan penyusunan ulang agar lebih sistematis dan mudah ditindaklanjuti.</w:t>
+        <w:t xml:space="preserve">Notulensi ini telah disusun berdasarkan poin-poin pembahasan dalam dokumen rapat dengan penyusunan ulang agar lebih sistematis dan mudah ditindaklanjuti. Bagian 07 (Catu Daya/Solar Panel) ditambahkan berdasarkan konfirmasi tim bahwa topik tersebut turut dibahas dalam rapat.</w:t>
       </w:r>
     </w:p>
     <w:sectPr>

</xml_diff>